<commit_message>
fix: EMG layout feedback round 1 (blank page, SMS line, Offertgueltigkeit)
- Remove trailing empty paragraph from the EMG chapter block: it spilled
  onto a new page and, combined with the KOSTEN page break, produced a
  completely blank page between chapter 3 and the cost section
- "inkl. SMS-Alarmierung/Web-Zugriff" moved to its own checkbox line
  below Konfiguration (checkbox order unchanged)
- EMG modes only: merge "Offertgueltigkeit: 90 Tage" into the end of the
  Vorlaufzeit paragraph (mirrors BPa's manual edit) so Datenschutz fits
  on the same page; plain BS output stays byte-identical (snapshot
  unchanged, 48 tests green)
- Pagination verified via CloudConvert PDFs: no blank pages in BS+EMG,
  EMG-only and BS+VA+EMG; Datenschutz complete on one page

Co-Authored-By: Claude Fable 5 <noreply@anthropic.com>
</commit_message>
<xml_diff>
--- a/hmq-offerten/public/Offerte_Template_V13.docx
+++ b/hmq-offerten/public/Offerte_Template_V13.docx
@@ -3043,12 +3043,21 @@
         </w:rPr>
         <w:t>{{EMG_GEOPHONE}}</w:t>
       </w:r>
-      <w:r>
-        <w:rPr>
-          <w:lang w:eastAsia="de-CH"/>
-        </w:rPr>
-        <w:t xml:space="preserve">      </w:t>
-      </w:r>
+    </w:p>
+    <w:p>
+      <w:pPr>
+        <w:pStyle w:val="Absatz1ohneTitelohneAbstandunten"/>
+        <w:numPr>
+          <w:ilvl w:val="0"/>
+          <w:numId w:val="0"/>
+        </w:numPr>
+        <w:tabs>
+          <w:tab w:val="left" w:pos="4678"/>
+          <w:tab w:val="left" w:pos="7797"/>
+        </w:tabs>
+        <w:spacing w:after="60"/>
+        <w:ind w:left="567"/>
+      </w:pPr>
       <w:sdt>
         <w:sdtPr>
           <w:id w:val="510000002"/>
@@ -3636,15 +3645,6 @@
         </w:rPr>
         <w:t>{{EMG_TARIFE}}</w:t>
       </w:r>
-    </w:p>
-    <w:p>
-      <w:pPr>
-        <w:spacing w:line="240" w:lineRule="auto"/>
-        <w:jc w:val="left"/>
-        <w:rPr>
-          <w:noProof/>
-        </w:rPr>
-      </w:pPr>
     </w:p>
     <w:p>
       <w:pPr>

</xml_diff>

<commit_message>
feat: zero before-spacing on Ueberschrift-2 titles, KOSTEN break for EMG-only
- All Ueberschrift-2 chapter titles: spacing before 24pt/10pt -> 0
  (direct formatting + style, template V13; per BPa layout feedback,
  applies to all offer types; visible text still identical to V12)
- KOSTEN page break now for every EMG mode: with the tighter spacing
  the chapter title in EMG-only ended up alone at a page bottom
- EMG-only additionally drops the spacer paragraph under the KOSTEN
  heading ({{EMGK_ABSTAND}} marker)
- Pagination verified via Word-rendered PDFs (AppleScript export):
  no blank pages, no orphaned titles, Kosten/Termine/Offertgueltigkeit/
  Datenschutz share one page in BS, BS+EMG and EMG-only; 48 tests green

Co-Authored-By: Claude Fable 5 <noreply@anthropic.com>
</commit_message>
<xml_diff>
--- a/hmq-offerten/public/Offerte_Template_V13.docx
+++ b/hmq-offerten/public/Offerte_Template_V13.docx
@@ -557,7 +557,7 @@
                 <w:tab w:val="num" w:pos="-2055"/>
                 <w:tab w:val="num" w:pos="641"/>
               </w:tabs>
-              <w:spacing w:before="480" w:after="120"/>
+              <w:spacing w:before="0" w:after="120"/>
               <w:ind w:left="567" w:hanging="567"/>
               <w:rPr>
                 <w:caps/>
@@ -1416,7 +1416,7 @@
           <w:ilvl w:val="0"/>
           <w:numId w:val="0"/>
         </w:numPr>
-        <w:spacing w:before="480" w:after="120"/>
+        <w:spacing w:before="0" w:after="120"/>
         <w:ind w:left="360"/>
         <w:rPr>
           <w:caps/>
@@ -1452,7 +1452,7 @@
           <w:tab w:val="num" w:pos="-2055"/>
           <w:tab w:val="num" w:pos="641"/>
         </w:tabs>
-        <w:spacing w:before="480" w:after="120"/>
+        <w:spacing w:before="0" w:after="120"/>
         <w:ind w:left="567" w:hanging="567"/>
         <w:rPr>
           <w:caps/>
@@ -2905,7 +2905,7 @@
           <w:tab w:val="num" w:pos="-2055"/>
           <w:tab w:val="num" w:pos="641"/>
         </w:tabs>
-        <w:spacing w:before="480" w:after="120"/>
+        <w:spacing w:before="0" w:after="120"/>
         <w:ind w:left="567" w:hanging="567"/>
         <w:rPr>
           <w:caps/>
@@ -3667,7 +3667,7 @@
           <w:tab w:val="num" w:pos="-2055"/>
           <w:tab w:val="num" w:pos="641"/>
         </w:tabs>
-        <w:spacing w:before="480" w:after="120"/>
+        <w:spacing w:before="0" w:after="120"/>
         <w:ind w:left="567" w:hanging="567"/>
         <w:rPr>
           <w:caps/>
@@ -4323,6 +4323,12 @@
           <w:b/>
         </w:rPr>
       </w:pPr>
+      <w:r>
+        <w:rPr>
+          <w:vanish/>
+        </w:rPr>
+        <w:t>{{EMGK_ABSTAND}}</w:t>
+      </w:r>
     </w:p>
     <w:p>
       <w:pPr>
@@ -5000,7 +5006,7 @@
           <w:tab w:val="num" w:pos="-2055"/>
           <w:tab w:val="num" w:pos="641"/>
         </w:tabs>
-        <w:spacing w:before="480" w:after="120"/>
+        <w:spacing w:before="0" w:after="120"/>
         <w:ind w:left="567" w:hanging="567"/>
         <w:rPr>
           <w:caps/>
@@ -5097,7 +5103,7 @@
           <w:tab w:val="num" w:pos="-2055"/>
           <w:tab w:val="num" w:pos="641"/>
         </w:tabs>
-        <w:spacing w:before="480" w:after="120"/>
+        <w:spacing w:before="0" w:after="120"/>
         <w:ind w:left="567" w:hanging="567"/>
         <w:rPr>
           <w:caps/>
@@ -5146,7 +5152,7 @@
           <w:tab w:val="num" w:pos="-2055"/>
           <w:tab w:val="num" w:pos="641"/>
         </w:tabs>
-        <w:spacing w:before="480" w:after="120"/>
+        <w:spacing w:before="0" w:after="120"/>
         <w:ind w:left="567" w:hanging="567"/>
         <w:rPr>
           <w:caps/>
@@ -8557,7 +8563,7 @@
       <w:numPr>
         <w:numId w:val="12"/>
       </w:numPr>
-      <w:spacing w:before="200"/>
+      <w:spacing w:before="0"/>
       <w:outlineLvl w:val="1"/>
     </w:pPr>
     <w:rPr>

</xml_diff>

<commit_message>
Revert "feat: zero before-spacing on Ueberschrift-2 titles, KOSTEN break for EMG-only"
This reverts commit e808cf4b0fd8b2837dfcea2095cdece01f452dfe.
</commit_message>
<xml_diff>
--- a/hmq-offerten/public/Offerte_Template_V13.docx
+++ b/hmq-offerten/public/Offerte_Template_V13.docx
@@ -557,7 +557,7 @@
                 <w:tab w:val="num" w:pos="-2055"/>
                 <w:tab w:val="num" w:pos="641"/>
               </w:tabs>
-              <w:spacing w:before="0" w:after="120"/>
+              <w:spacing w:before="480" w:after="120"/>
               <w:ind w:left="567" w:hanging="567"/>
               <w:rPr>
                 <w:caps/>
@@ -1416,7 +1416,7 @@
           <w:ilvl w:val="0"/>
           <w:numId w:val="0"/>
         </w:numPr>
-        <w:spacing w:before="0" w:after="120"/>
+        <w:spacing w:before="480" w:after="120"/>
         <w:ind w:left="360"/>
         <w:rPr>
           <w:caps/>
@@ -1452,7 +1452,7 @@
           <w:tab w:val="num" w:pos="-2055"/>
           <w:tab w:val="num" w:pos="641"/>
         </w:tabs>
-        <w:spacing w:before="0" w:after="120"/>
+        <w:spacing w:before="480" w:after="120"/>
         <w:ind w:left="567" w:hanging="567"/>
         <w:rPr>
           <w:caps/>
@@ -2905,7 +2905,7 @@
           <w:tab w:val="num" w:pos="-2055"/>
           <w:tab w:val="num" w:pos="641"/>
         </w:tabs>
-        <w:spacing w:before="0" w:after="120"/>
+        <w:spacing w:before="480" w:after="120"/>
         <w:ind w:left="567" w:hanging="567"/>
         <w:rPr>
           <w:caps/>
@@ -3667,7 +3667,7 @@
           <w:tab w:val="num" w:pos="-2055"/>
           <w:tab w:val="num" w:pos="641"/>
         </w:tabs>
-        <w:spacing w:before="0" w:after="120"/>
+        <w:spacing w:before="480" w:after="120"/>
         <w:ind w:left="567" w:hanging="567"/>
         <w:rPr>
           <w:caps/>
@@ -4323,12 +4323,6 @@
           <w:b/>
         </w:rPr>
       </w:pPr>
-      <w:r>
-        <w:rPr>
-          <w:vanish/>
-        </w:rPr>
-        <w:t>{{EMGK_ABSTAND}}</w:t>
-      </w:r>
     </w:p>
     <w:p>
       <w:pPr>
@@ -5006,7 +5000,7 @@
           <w:tab w:val="num" w:pos="-2055"/>
           <w:tab w:val="num" w:pos="641"/>
         </w:tabs>
-        <w:spacing w:before="0" w:after="120"/>
+        <w:spacing w:before="480" w:after="120"/>
         <w:ind w:left="567" w:hanging="567"/>
         <w:rPr>
           <w:caps/>
@@ -5103,7 +5097,7 @@
           <w:tab w:val="num" w:pos="-2055"/>
           <w:tab w:val="num" w:pos="641"/>
         </w:tabs>
-        <w:spacing w:before="0" w:after="120"/>
+        <w:spacing w:before="480" w:after="120"/>
         <w:ind w:left="567" w:hanging="567"/>
         <w:rPr>
           <w:caps/>
@@ -5152,7 +5146,7 @@
           <w:tab w:val="num" w:pos="-2055"/>
           <w:tab w:val="num" w:pos="641"/>
         </w:tabs>
-        <w:spacing w:before="0" w:after="120"/>
+        <w:spacing w:before="480" w:after="120"/>
         <w:ind w:left="567" w:hanging="567"/>
         <w:rPr>
           <w:caps/>
@@ -8563,7 +8557,7 @@
       <w:numPr>
         <w:numId w:val="12"/>
       </w:numPr>
-      <w:spacing w:before="0"/>
+      <w:spacing w:before="200"/>
       <w:outlineLvl w:val="1"/>
     </w:pPr>
     <w:rPr>

</xml_diff>